<commit_message>
Fix template section-0 headers: replace hardcoded JV name with placeholders, style headers bold
Co-Authored-By: Claude Sonnet 4.6 <noreply@anthropic.com>
</commit_message>
<xml_diff>
--- a/templates/master_template_2.docx
+++ b/templates/master_template_2.docx
@@ -13243,14 +13243,12 @@
         <w:szCs w:val="44"/>
       </w:rPr>
     </w:pPr>
-    <w:bookmarkStart w:id="0" w:name="_Hlk153986048"/>
-    <w:bookmarkStart w:id="1" w:name="_Hlk153986049"/>
     <w:r>
       <w:rPr>
-        <w:sz w:val="44"/>
-        <w:szCs w:val="44"/>
-      </w:rPr>
-      <w:t>SARA-SHEAR J/V</w:t>
+        <w:b/>
+        <w:sz w:val="26"/>
+      </w:rPr>
+      <w:t>{{JV_NAME}}</w:t>
     </w:r>
   </w:p>
   <w:p>
@@ -13264,33 +13262,10 @@
     </w:pPr>
     <w:r>
       <w:rPr>
-        <w:sz w:val="36"/>
-        <w:szCs w:val="36"/>
-      </w:rPr>
-      <w:t>Dharan-16,</w:t>
-    </w:r>
-    <w:r>
-      <w:rPr>
-        <w:sz w:val="36"/>
-        <w:szCs w:val="36"/>
-      </w:rPr>
-      <w:t xml:space="preserve"> </w:t>
-    </w:r>
-    <w:r>
-      <w:rPr>
-        <w:sz w:val="36"/>
-        <w:szCs w:val="36"/>
-      </w:rPr>
-      <w:t>Suns</w:t>
-    </w:r>
-    <w:bookmarkEnd w:id="0"/>
-    <w:bookmarkEnd w:id="1"/>
-    <w:r>
-      <w:rPr>
-        <w:sz w:val="36"/>
-        <w:szCs w:val="36"/>
-      </w:rPr>
-      <w:t>ari</w:t>
+        <w:b w:val="0"/>
+        <w:sz w:val="20"/>
+      </w:rPr>
+      <w:t>{{JV_ADDRESS}}</w:t>
     </w:r>
   </w:p>
 </w:hdr>
@@ -13305,7 +13280,7 @@
     <w:r>
       <w:rPr>
         <w:b/>
-        <w:sz w:val="32"/>
+        <w:sz w:val="26"/>
       </w:rPr>
       <w:t>{{JV_NAME}}</w:t>
     </w:r>
@@ -13316,70 +13291,8 @@
     </w:pPr>
     <w:r>
       <w:rPr>
-        <w:noProof/>
-      </w:rPr>
-      <mc:AlternateContent>
-        <mc:Choice Requires="wps">
-          <w:drawing>
-            <wp:anchor distT="0" distB="0" distL="114300" distR="114300" simplePos="0" relativeHeight="251658240" behindDoc="0" locked="0" layoutInCell="1" allowOverlap="1" wp14:anchorId="53744E17" wp14:editId="17D768B2">
-              <wp:simplePos x="0" y="0"/>
-              <wp:positionH relativeFrom="column">
-                <wp:posOffset>-926276</wp:posOffset>
-              </wp:positionH>
-              <wp:positionV relativeFrom="paragraph">
-                <wp:posOffset>373314</wp:posOffset>
-              </wp:positionV>
-              <wp:extent cx="7350826" cy="0"/>
-              <wp:effectExtent l="38100" t="38100" r="59690" b="95250"/>
-              <wp:wrapNone/>
-              <wp:docPr id="1224231245" name="Straight Connector 1"/>
-              <wp:cNvGraphicFramePr/>
-              <a:graphic xmlns:a="http://schemas.openxmlformats.org/drawingml/2006/main">
-                <a:graphicData uri="http://schemas.microsoft.com/office/word/2010/wordprocessingShape">
-                  <wps:wsp>
-                    <wps:cNvCnPr/>
-                    <wps:spPr>
-                      <a:xfrm>
-                        <a:off x="0" y="0"/>
-                        <a:ext cx="7350826" cy="0"/>
-                      </a:xfrm>
-                      <a:prstGeom prst="line">
-                        <a:avLst/>
-                      </a:prstGeom>
-                    </wps:spPr>
-                    <wps:style>
-                      <a:lnRef idx="2">
-                        <a:schemeClr val="accent1"/>
-                      </a:lnRef>
-                      <a:fillRef idx="0">
-                        <a:schemeClr val="accent1"/>
-                      </a:fillRef>
-                      <a:effectRef idx="1">
-                        <a:schemeClr val="accent1"/>
-                      </a:effectRef>
-                      <a:fontRef idx="minor">
-                        <a:schemeClr val="tx1"/>
-                      </a:fontRef>
-                    </wps:style>
-                    <wps:bodyPr/>
-                  </wps:wsp>
-                </a:graphicData>
-              </a:graphic>
-            </wp:anchor>
-          </w:drawing>
-        </mc:Choice>
-        <mc:Fallback>
-          <w:pict>
-            <v:line w14:anchorId="4F867E03" id="Straight Connector 1" o:spid="_x0000_s1026" style="position:absolute;z-index:251658240;visibility:visible;mso-wrap-style:square;mso-wrap-distance-left:9pt;mso-wrap-distance-top:0;mso-wrap-distance-right:9pt;mso-wrap-distance-bottom:0;mso-position-horizontal:absolute;mso-position-horizontal-relative:text;mso-position-vertical:absolute;mso-position-vertical-relative:text" from="-72.95pt,29.4pt" to="505.85pt,29.4pt" o:gfxdata="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" strokecolor="#4f81bd [3204]" strokeweight="2pt">
-              <v:shadow on="t" color="black" opacity="24903f" origin=",.5" offset="0,.55556mm"/>
-            </v:line>
-          </w:pict>
-        </mc:Fallback>
-      </mc:AlternateContent>
-    </w:r>
-    <w:r>
-      <w:rPr>
-        <w:sz w:val="24"/>
+        <w:b w:val="0"/>
+        <w:sz w:val="20"/>
       </w:rPr>
       <w:t>{{JV_ADDRESS}}</w:t>
     </w:r>
@@ -13405,23 +13318,9 @@
     <w:r>
       <w:rPr>
         <w:b/>
-        <w:sz w:val="32"/>
-      </w:rPr>
-      <w:t>{{</w:t>
-    </w:r>
-    <w:r>
-      <w:rPr>
-        <w:b/>
-        <w:sz w:val="32"/>
-      </w:rPr>
-      <w:t>LEAD</w:t>
-    </w:r>
-    <w:r>
-      <w:rPr>
-        <w:b/>
-        <w:sz w:val="32"/>
-      </w:rPr>
-      <w:t>_PARTNER_NAME}}</w:t>
+        <w:sz w:val="26"/>
+      </w:rPr>
+      <w:t>{{LEAD_PARTNER_NAME}}</w:t>
     </w:r>
   </w:p>
   <w:p>
@@ -13430,21 +13329,10 @@
     </w:pPr>
     <w:r>
       <w:rPr>
-        <w:sz w:val="24"/>
-      </w:rPr>
-      <w:t>{{</w:t>
-    </w:r>
-    <w:r>
-      <w:rPr>
-        <w:sz w:val="24"/>
-      </w:rPr>
-      <w:t>LEAD_ADDRESS</w:t>
-    </w:r>
-    <w:r>
-      <w:rPr>
-        <w:sz w:val="24"/>
-      </w:rPr>
-      <w:t>}}</w:t>
+        <w:b w:val="0"/>
+        <w:sz w:val="20"/>
+      </w:rPr>
+      <w:t>{{LEAD_ADDRESS}}</w:t>
     </w:r>
   </w:p>
   <w:p>
@@ -13531,23 +13419,9 @@
     <w:r>
       <w:rPr>
         <w:b/>
-        <w:sz w:val="32"/>
-      </w:rPr>
-      <w:t>{{</w:t>
-    </w:r>
-    <w:r>
-      <w:rPr>
-        <w:b/>
-        <w:sz w:val="32"/>
-      </w:rPr>
-      <w:t>FIRST</w:t>
-    </w:r>
-    <w:r>
-      <w:rPr>
-        <w:b/>
-        <w:sz w:val="32"/>
-      </w:rPr>
-      <w:t>_PARTNER_NAME}}</w:t>
+        <w:sz w:val="26"/>
+      </w:rPr>
+      <w:t>{{FIRST_PARTNER_NAME}}</w:t>
     </w:r>
   </w:p>
   <w:p>
@@ -13556,84 +13430,10 @@
     </w:pPr>
     <w:r>
       <w:rPr>
-        <w:noProof/>
-      </w:rPr>
-      <mc:AlternateContent>
-        <mc:Choice Requires="wps">
-          <w:drawing>
-            <wp:anchor distT="0" distB="0" distL="114300" distR="114300" simplePos="0" relativeHeight="251660288" behindDoc="0" locked="0" layoutInCell="1" allowOverlap="1" wp14:anchorId="74FED653" wp14:editId="532C91A0">
-              <wp:simplePos x="0" y="0"/>
-              <wp:positionH relativeFrom="column">
-                <wp:posOffset>-276446</wp:posOffset>
-              </wp:positionH>
-              <wp:positionV relativeFrom="paragraph">
-                <wp:posOffset>335812</wp:posOffset>
-              </wp:positionV>
-              <wp:extent cx="7350826" cy="0"/>
-              <wp:effectExtent l="38100" t="38100" r="59690" b="95250"/>
-              <wp:wrapNone/>
-              <wp:docPr id="411396277" name="Straight Connector 1"/>
-              <wp:cNvGraphicFramePr/>
-              <a:graphic xmlns:a="http://schemas.openxmlformats.org/drawingml/2006/main">
-                <a:graphicData uri="http://schemas.microsoft.com/office/word/2010/wordprocessingShape">
-                  <wps:wsp>
-                    <wps:cNvCnPr/>
-                    <wps:spPr>
-                      <a:xfrm>
-                        <a:off x="0" y="0"/>
-                        <a:ext cx="7350826" cy="0"/>
-                      </a:xfrm>
-                      <a:prstGeom prst="line">
-                        <a:avLst/>
-                      </a:prstGeom>
-                    </wps:spPr>
-                    <wps:style>
-                      <a:lnRef idx="2">
-                        <a:schemeClr val="accent1"/>
-                      </a:lnRef>
-                      <a:fillRef idx="0">
-                        <a:schemeClr val="accent1"/>
-                      </a:fillRef>
-                      <a:effectRef idx="1">
-                        <a:schemeClr val="accent1"/>
-                      </a:effectRef>
-                      <a:fontRef idx="minor">
-                        <a:schemeClr val="tx1"/>
-                      </a:fontRef>
-                    </wps:style>
-                    <wps:bodyPr/>
-                  </wps:wsp>
-                </a:graphicData>
-              </a:graphic>
-            </wp:anchor>
-          </w:drawing>
-        </mc:Choice>
-        <mc:Fallback>
-          <w:pict>
-            <v:line w14:anchorId="71463942" id="Straight Connector 1" o:spid="_x0000_s1026" style="position:absolute;z-index:251660288;visibility:visible;mso-wrap-style:square;mso-wrap-distance-left:9pt;mso-wrap-distance-top:0;mso-wrap-distance-right:9pt;mso-wrap-distance-bottom:0;mso-position-horizontal:absolute;mso-position-horizontal-relative:text;mso-position-vertical:absolute;mso-position-vertical-relative:text" from="-21.75pt,26.45pt" to="557.05pt,26.45pt" o:gfxdata="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" strokecolor="#4f81bd [3204]" strokeweight="2pt">
-              <v:shadow on="t" color="black" opacity="24903f" origin=",.5" offset="0,.55556mm"/>
-            </v:line>
-          </w:pict>
-        </mc:Fallback>
-      </mc:AlternateContent>
-    </w:r>
-    <w:r>
-      <w:rPr>
-        <w:sz w:val="24"/>
-      </w:rPr>
-      <w:t>{{</w:t>
-    </w:r>
-    <w:r>
-      <w:rPr>
-        <w:sz w:val="24"/>
-      </w:rPr>
-      <w:t>FIRST</w:t>
-    </w:r>
-    <w:r>
-      <w:rPr>
-        <w:sz w:val="24"/>
-      </w:rPr>
-      <w:t>_ADDRESS}}</w:t>
+        <w:b w:val="0"/>
+        <w:sz w:val="20"/>
+      </w:rPr>
+      <w:t>{{FIRST_ADDRESS}}</w:t>
     </w:r>
   </w:p>
   <w:p>
@@ -13657,7 +13457,7 @@
     <w:r>
       <w:rPr>
         <w:b/>
-        <w:sz w:val="32"/>
+        <w:sz w:val="26"/>
       </w:rPr>
       <w:t>{{LEAD_PARTNER_NAME}}</w:t>
     </w:r>
@@ -13668,70 +13468,8 @@
     </w:pPr>
     <w:r>
       <w:rPr>
-        <w:noProof/>
-      </w:rPr>
-      <mc:AlternateContent>
-        <mc:Choice Requires="wps">
-          <w:drawing>
-            <wp:anchor distT="0" distB="0" distL="114300" distR="114300" simplePos="0" relativeHeight="251662336" behindDoc="0" locked="0" layoutInCell="1" allowOverlap="1" wp14:anchorId="318BE095" wp14:editId="5E3377DD">
-              <wp:simplePos x="0" y="0"/>
-              <wp:positionH relativeFrom="column">
-                <wp:posOffset>-276446</wp:posOffset>
-              </wp:positionH>
-              <wp:positionV relativeFrom="paragraph">
-                <wp:posOffset>335812</wp:posOffset>
-              </wp:positionV>
-              <wp:extent cx="7350826" cy="0"/>
-              <wp:effectExtent l="38100" t="38100" r="59690" b="95250"/>
-              <wp:wrapNone/>
-              <wp:docPr id="341336042" name="Straight Connector 1"/>
-              <wp:cNvGraphicFramePr/>
-              <a:graphic xmlns:a="http://schemas.openxmlformats.org/drawingml/2006/main">
-                <a:graphicData uri="http://schemas.microsoft.com/office/word/2010/wordprocessingShape">
-                  <wps:wsp>
-                    <wps:cNvCnPr/>
-                    <wps:spPr>
-                      <a:xfrm>
-                        <a:off x="0" y="0"/>
-                        <a:ext cx="7350826" cy="0"/>
-                      </a:xfrm>
-                      <a:prstGeom prst="line">
-                        <a:avLst/>
-                      </a:prstGeom>
-                    </wps:spPr>
-                    <wps:style>
-                      <a:lnRef idx="2">
-                        <a:schemeClr val="accent1"/>
-                      </a:lnRef>
-                      <a:fillRef idx="0">
-                        <a:schemeClr val="accent1"/>
-                      </a:fillRef>
-                      <a:effectRef idx="1">
-                        <a:schemeClr val="accent1"/>
-                      </a:effectRef>
-                      <a:fontRef idx="minor">
-                        <a:schemeClr val="tx1"/>
-                      </a:fontRef>
-                    </wps:style>
-                    <wps:bodyPr/>
-                  </wps:wsp>
-                </a:graphicData>
-              </a:graphic>
-            </wp:anchor>
-          </w:drawing>
-        </mc:Choice>
-        <mc:Fallback>
-          <w:pict>
-            <v:line w14:anchorId="1177FADE" id="Straight Connector 1" o:spid="_x0000_s1026" style="position:absolute;z-index:251662336;visibility:visible;mso-wrap-style:square;mso-wrap-distance-left:9pt;mso-wrap-distance-top:0;mso-wrap-distance-right:9pt;mso-wrap-distance-bottom:0;mso-position-horizontal:absolute;mso-position-horizontal-relative:text;mso-position-vertical:absolute;mso-position-vertical-relative:text" from="-21.75pt,26.45pt" to="557.05pt,26.45pt" o:gfxdata="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" strokecolor="#4f81bd [3204]" strokeweight="2pt">
-              <v:shadow on="t" color="black" opacity="24903f" origin=",.5" offset="0,.55556mm"/>
-            </v:line>
-          </w:pict>
-        </mc:Fallback>
-      </mc:AlternateContent>
-    </w:r>
-    <w:r>
-      <w:rPr>
-        <w:sz w:val="24"/>
+        <w:b w:val="0"/>
+        <w:sz w:val="20"/>
       </w:rPr>
       <w:t>{{LEAD_ADDRESS}}</w:t>
     </w:r>

</xml_diff>